<commit_message>
Phase 7 renderer: 5 DOCX fixes, skip PPTX, add Cowork deck button
- Strip markdown title front-matter (duplicate of cover page) from body
- Add 200-twip paragraph spacing to Normal style in all 4 DOCX templates
- Skip --- horizontal rules instead of rendering as literal text
- Number endnote entries (1. 2. 3...) in Endnotes section
- Extract inline citations in Retainer Proposal to superscript + endnotes
- Skip Presentation Deck (PPTX) rendering — handled via Cowork
- Add "Build Presentation Deck" button in Phase Commands (copies Cowork command)

Co-Authored-By: Claude Opus 4.6 (1M context) <noreply@anthropic.com>
</commit_message>
<xml_diff>
--- a/backend/templates/10_Executive_Summary.docx
+++ b/backend/templates/10_Executive_Summary.docx
@@ -643,5 +643,11 @@
       <w:szCs w:val="20"/>
     </w:rPr>
   </w:style>
+  <w:style w:type="paragraph" w:styleId="Normal" w:default="1">
+    <w:name w:val="Normal"/>
+    <w:pPr>
+      <w:spacing w:after="200"/>
+    </w:pPr>
+  </w:style>
 </w:styles>
 </file>
</xml_diff>